<commit_message>
Actualizar documento de necesidad y diseno de churn (AE2)
Co-Authored-By: Claude Opus 5.5 <noreply@anthropic.com>
</commit_message>
<xml_diff>
--- a/AE2/documento/AE2_Necesidad_Diseno_Churn.docx
+++ b/AE2/documento/AE2_Necesidad_Diseno_Churn.docx
@@ -2,9 +2,6 @@
 <file path=word/document.xml><?xml version="1.0" encoding="utf-8"?>
 <w:document xmlns:wpc="http://schemas.microsoft.com/office/word/2010/wordprocessingCanvas" xmlns:cx="http://schemas.microsoft.com/office/drawing/2014/chartex" xmlns:cx1="http://schemas.microsoft.com/office/drawing/2015/9/8/chartex" xmlns:cx2="http://schemas.microsoft.com/office/drawing/2015/10/21/chartex" xmlns:cx3="http://schemas.microsoft.com/office/drawing/2016/5/9/chartex" xmlns:cx4="http://schemas.microsoft.com/office/drawing/2016/5/10/chartex" xmlns:cx5="http://schemas.microsoft.com/office/drawing/2016/5/11/chartex" xmlns:cx6="http://schemas.microsoft.com/office/drawing/2016/5/12/chartex" xmlns:cx7="http://schemas.microsoft.com/office/drawing/2016/5/13/chartex" xmlns:cx8="http://schemas.microsoft.com/office/drawing/2016/5/14/chartex" xmlns:mc="http://schemas.openxmlformats.org/markup-compatibility/2006" xmlns:aink="http://schemas.microsoft.com/office/drawing/2016/ink" xmlns:am3d="http://schemas.microsoft.com/office/drawing/2017/model3d" xmlns:o="urn:schemas-microsoft-com:office:office" xmlns:oel="http://schemas.microsoft.com/office/2019/extlst" xmlns:r="http://schemas.openxmlformats.org/officeDocument/2006/relationships" xmlns:m="http://schemas.openxmlformats.org/officeDocument/2006/math" xmlns:v="urn:schemas-microsoft-com:vml" xmlns:wp14="http://schemas.microsoft.com/office/word/2010/wordprocessingDrawing" xmlns:wp="http://schemas.openxmlformats.org/drawingml/2006/wordprocessingDrawing" xmlns:w10="urn:schemas-microsoft-com:office:word" xmlns:w="http://schemas.openxmlformats.org/wordprocessingml/2006/main" xmlns:w14="http://schemas.microsoft.com/office/word/2010/wordml" xmlns:w15="http://schemas.microsoft.com/office/word/2012/wordml" xmlns:w16cex="http://schemas.microsoft.com/office/word/2018/wordml/cex" xmlns:w16cid="http://schemas.microsoft.com/office/word/2016/wordml/cid" xmlns:w16="http://schemas.microsoft.com/office/word/2018/wordml" xmlns:w16du="http://schemas.microsoft.com/office/word/2023/wordml/word16du" xmlns:w16sdtdh="http://schemas.microsoft.com/office/word/2020/wordml/sdtdatahash" xmlns:w16sdtfl="http://schemas.microsoft.com/office/word/2024/wordml/sdtformatlock" xmlns:w16se="http://schemas.microsoft.com/office/word/2015/wordml/symex" xmlns:wpg="http://schemas.microsoft.com/office/word/2010/wordprocessingGroup" xmlns:wpi="http://schemas.microsoft.com/office/word/2010/wordprocessingInk" xmlns:wne="http://schemas.microsoft.com/office/word/2006/wordml" xmlns:wps="http://schemas.microsoft.com/office/word/2010/wordprocessingShape" mc:Ignorable="w14 w15 w16se w16cid w16 w16cex w16sdtdh w16sdtfl w16du wp14">
   <w:body>
-    <w:p/>
-    <w:p/>
-    <w:p/>
     <w:p>
       <w:pPr>
         <w:jc w:val="center"/>
@@ -29,105 +26,279 @@
         <w:t>Proyecto integrador · Primera etapa: ideación, diseño y documentación de la necesidad (AE2)</w:t>
       </w:r>
     </w:p>
-    <w:p/>
-    <w:p/>
-    <w:p/>
-    <w:p/>
     <w:p>
       <w:pPr>
         <w:jc w:val="center"/>
+        <w:rPr>
+          <w:sz w:val="32"/>
+          <w:szCs w:val="32"/>
+        </w:rPr>
+      </w:pPr>
+    </w:p>
+    <w:p>
+      <w:pPr>
+        <w:jc w:val="center"/>
+        <w:rPr>
+          <w:sz w:val="32"/>
+          <w:szCs w:val="32"/>
+        </w:rPr>
+      </w:pPr>
+    </w:p>
+    <w:p>
+      <w:pPr>
+        <w:jc w:val="center"/>
+        <w:rPr>
+          <w:sz w:val="32"/>
+          <w:szCs w:val="32"/>
+        </w:rPr>
+      </w:pPr>
+    </w:p>
+    <w:p>
+      <w:pPr>
+        <w:jc w:val="center"/>
+        <w:rPr>
+          <w:sz w:val="32"/>
+          <w:szCs w:val="32"/>
+        </w:rPr>
+      </w:pPr>
+    </w:p>
+    <w:p>
+      <w:pPr>
+        <w:jc w:val="center"/>
+        <w:rPr>
+          <w:sz w:val="32"/>
+          <w:szCs w:val="32"/>
+        </w:rPr>
+      </w:pPr>
+    </w:p>
+    <w:p>
+      <w:pPr>
+        <w:jc w:val="center"/>
+        <w:rPr>
+          <w:sz w:val="32"/>
+          <w:szCs w:val="32"/>
+        </w:rPr>
+      </w:pPr>
+    </w:p>
+    <w:p>
+      <w:pPr>
+        <w:jc w:val="center"/>
+        <w:rPr>
+          <w:sz w:val="32"/>
+          <w:szCs w:val="32"/>
+        </w:rPr>
       </w:pPr>
       <w:r>
         <w:rPr>
-          <w:b/>
+          <w:sz w:val="32"/>
+          <w:szCs w:val="32"/>
         </w:rPr>
-        <w:t xml:space="preserve">Integrante(s): </w:t>
+        <w:t xml:space="preserve">Jose Quevin Ordoñez </w:t>
       </w:r>
       <w:r>
-        <w:t>Quevin Ordoñez</w:t>
+        <w:rPr>
+          <w:sz w:val="32"/>
+          <w:szCs w:val="32"/>
+        </w:rPr>
+        <w:t>Sánchez</w:t>
       </w:r>
     </w:p>
     <w:p>
       <w:pPr>
         <w:jc w:val="center"/>
+        <w:rPr>
+          <w:sz w:val="32"/>
+          <w:szCs w:val="32"/>
+        </w:rPr>
       </w:pPr>
       <w:r>
         <w:rPr>
-          <w:b/>
+          <w:sz w:val="32"/>
+          <w:szCs w:val="32"/>
+          <w:lang w:val="es-ES"/>
         </w:rPr>
-        <w:t xml:space="preserve">Grupo: </w:t>
+        <w:t>2026</w:t>
+      </w:r>
+    </w:p>
+    <w:p>
+      <w:pPr>
+        <w:jc w:val="center"/>
+        <w:rPr>
+          <w:sz w:val="32"/>
+          <w:szCs w:val="32"/>
+        </w:rPr>
+      </w:pPr>
+    </w:p>
+    <w:p>
+      <w:pPr>
+        <w:jc w:val="center"/>
+        <w:rPr>
+          <w:sz w:val="32"/>
+          <w:szCs w:val="32"/>
+        </w:rPr>
+      </w:pPr>
+    </w:p>
+    <w:p>
+      <w:pPr>
+        <w:jc w:val="center"/>
+        <w:rPr>
+          <w:sz w:val="32"/>
+          <w:szCs w:val="32"/>
+        </w:rPr>
+      </w:pPr>
+    </w:p>
+    <w:p>
+      <w:pPr>
+        <w:jc w:val="center"/>
+        <w:rPr>
+          <w:sz w:val="32"/>
+          <w:szCs w:val="32"/>
+        </w:rPr>
+      </w:pPr>
+    </w:p>
+    <w:p>
+      <w:pPr>
+        <w:jc w:val="center"/>
+        <w:rPr>
+          <w:sz w:val="32"/>
+          <w:szCs w:val="32"/>
+        </w:rPr>
+      </w:pPr>
+    </w:p>
+    <w:p>
+      <w:pPr>
+        <w:jc w:val="center"/>
+        <w:rPr>
+          <w:sz w:val="32"/>
+          <w:szCs w:val="32"/>
+        </w:rPr>
+      </w:pPr>
+    </w:p>
+    <w:p>
+      <w:pPr>
+        <w:jc w:val="center"/>
+        <w:rPr>
+          <w:sz w:val="32"/>
+          <w:szCs w:val="32"/>
+        </w:rPr>
+      </w:pPr>
+    </w:p>
+    <w:p>
+      <w:pPr>
+        <w:jc w:val="center"/>
+        <w:rPr>
+          <w:sz w:val="32"/>
+          <w:szCs w:val="32"/>
+          <w:lang w:val="es-ES"/>
+        </w:rPr>
+      </w:pPr>
+      <w:r>
+        <w:rPr>
+          <w:sz w:val="32"/>
+          <w:szCs w:val="32"/>
+          <w:lang w:val="es-ES"/>
+        </w:rPr>
+        <w:t>Institución Universitaria Digital de Antioquia</w:t>
+      </w:r>
+    </w:p>
+    <w:p>
+      <w:pPr>
+        <w:jc w:val="center"/>
+        <w:rPr>
+          <w:sz w:val="32"/>
+          <w:szCs w:val="32"/>
+          <w:lang w:val="es-ES"/>
+        </w:rPr>
+      </w:pPr>
+      <w:r>
+        <w:rPr>
+          <w:sz w:val="32"/>
+          <w:szCs w:val="32"/>
+          <w:lang w:val="es-ES"/>
+        </w:rPr>
+        <w:t>Medellín, Antioquia.</w:t>
+      </w:r>
+    </w:p>
+    <w:p>
+      <w:pPr>
+        <w:jc w:val="center"/>
+        <w:rPr>
+          <w:sz w:val="32"/>
+          <w:szCs w:val="32"/>
+          <w:lang w:val="es-ES"/>
+        </w:rPr>
+      </w:pPr>
+      <w:r>
+        <w:rPr>
+          <w:sz w:val="32"/>
+          <w:szCs w:val="32"/>
+          <w:lang w:val="es-ES"/>
+        </w:rPr>
+        <w:t>Analítica de Datos</w:t>
+      </w:r>
+    </w:p>
+    <w:p>
+      <w:pPr>
+        <w:jc w:val="center"/>
+        <w:rPr>
+          <w:sz w:val="24"/>
+          <w:szCs w:val="24"/>
+          <w:lang w:val="es-ES"/>
+        </w:rPr>
+      </w:pPr>
+      <w:r>
+        <w:rPr>
+          <w:sz w:val="32"/>
+          <w:szCs w:val="32"/>
+          <w:lang w:val="es-ES"/>
+        </w:rPr>
+        <w:t>A</w:t>
       </w:r>
       <w:r>
         <w:rPr>
-          <w:highlight w:val="yellow"/>
+          <w:sz w:val="32"/>
+          <w:szCs w:val="32"/>
+          <w:lang w:val="es-ES"/>
         </w:rPr>
-        <w:t>[COMPLETAR]</w:t>
-      </w:r>
-    </w:p>
-    <w:p>
-      <w:pPr>
-        <w:jc w:val="center"/>
-      </w:pPr>
-      <w:r>
-        <w:rPr>
-          <w:b/>
-        </w:rPr>
-        <w:t xml:space="preserve">Asignatura: </w:t>
-      </w:r>
-      <w:r>
-        <w:t>Proyecto Integrador — Analítica de Datos</w:t>
-      </w:r>
-    </w:p>
-    <w:p>
-      <w:pPr>
-        <w:jc w:val="center"/>
-      </w:pPr>
-      <w:r>
-        <w:rPr>
-          <w:b/>
-        </w:rPr>
-        <w:t xml:space="preserve">Docente: </w:t>
+        <w:t xml:space="preserve">ndres </w:t>
       </w:r>
       <w:r>
         <w:rPr>
-          <w:highlight w:val="yellow"/>
+          <w:sz w:val="32"/>
+          <w:szCs w:val="32"/>
+          <w:lang w:val="es-ES"/>
         </w:rPr>
-        <w:t>[COMPLETAR]</w:t>
-      </w:r>
-    </w:p>
-    <w:p>
-      <w:pPr>
-        <w:jc w:val="center"/>
-      </w:pPr>
-      <w:r>
-        <w:rPr>
-          <w:b/>
-        </w:rPr>
-        <w:t xml:space="preserve">Institución: </w:t>
+        <w:t>F</w:t>
       </w:r>
       <w:r>
         <w:rPr>
-          <w:highlight w:val="yellow"/>
+          <w:sz w:val="32"/>
+          <w:szCs w:val="32"/>
+          <w:lang w:val="es-ES"/>
         </w:rPr>
-        <w:t>[COMPLETAR]</w:t>
+        <w:t xml:space="preserve">elipe </w:t>
       </w:r>
-    </w:p>
-    <w:p>
-      <w:pPr>
-        <w:jc w:val="center"/>
-      </w:pPr>
       <w:r>
         <w:rPr>
-          <w:b/>
+          <w:sz w:val="32"/>
+          <w:szCs w:val="32"/>
+          <w:lang w:val="es-ES"/>
         </w:rPr>
-        <w:t xml:space="preserve">Fecha: </w:t>
+        <w:t>C</w:t>
       </w:r>
       <w:r>
-        <w:t>25 de octubre de 2026</w:t>
+        <w:rPr>
+          <w:sz w:val="32"/>
+          <w:szCs w:val="32"/>
+          <w:lang w:val="es-ES"/>
+        </w:rPr>
+        <w:t>allejas</w:t>
       </w:r>
-    </w:p>
-    <w:p>
       <w:r>
+        <w:rPr>
+          <w:rFonts w:ascii="Google Sans" w:eastAsia="Google Sans" w:hAnsi="Google Sans" w:cs="Google Sans"/>
+          <w:color w:val="1F1F1F"/>
+        </w:rPr>
         <w:br w:type="page"/>
       </w:r>
     </w:p>
@@ -138,6 +309,7 @@
           <w:color w:val="1F3A5F"/>
           <w:sz w:val="28"/>
         </w:rPr>
+        <w:lastRenderedPageBreak/>
         <w:t>Tabla de contenido</w:t>
       </w:r>
     </w:p>
@@ -149,11 +321,10 @@
         </w:tabs>
         <w:rPr>
           <w:rFonts w:asciiTheme="minorHAnsi" w:eastAsiaTheme="minorEastAsia" w:hAnsiTheme="minorHAnsi"/>
-          <w:noProof/>
           <w:kern w:val="2"/>
           <w:sz w:val="24"/>
           <w:szCs w:val="24"/>
-          <w:lang w:val="es-CO" w:eastAsia="es-CO"/>
+          <w:lang w:eastAsia="es-CO"/>
           <w14:ligatures w14:val="standardContextual"/>
         </w:rPr>
       </w:pPr>
@@ -170,54 +341,46 @@
         <w:r>
           <w:rPr>
             <w:rStyle w:val="Hipervnculo"/>
-            <w:noProof/>
           </w:rPr>
           <w:t>1. Introducción</w:t>
         </w:r>
         <w:r>
           <w:rPr>
-            <w:noProof/>
             <w:webHidden/>
           </w:rPr>
           <w:tab/>
         </w:r>
         <w:r>
           <w:rPr>
-            <w:noProof/>
             <w:webHidden/>
           </w:rPr>
           <w:fldChar w:fldCharType="begin"/>
         </w:r>
         <w:r>
           <w:rPr>
-            <w:noProof/>
             <w:webHidden/>
           </w:rPr>
           <w:instrText xml:space="preserve"> PAGEREF _Toc243829177 \h </w:instrText>
         </w:r>
         <w:r>
           <w:rPr>
-            <w:noProof/>
             <w:webHidden/>
           </w:rPr>
         </w:r>
         <w:r>
           <w:rPr>
-            <w:noProof/>
             <w:webHidden/>
           </w:rPr>
           <w:fldChar w:fldCharType="separate"/>
         </w:r>
         <w:r>
           <w:rPr>
-            <w:noProof/>
             <w:webHidden/>
           </w:rPr>
           <w:t>3</w:t>
         </w:r>
         <w:r>
           <w:rPr>
-            <w:noProof/>
             <w:webHidden/>
           </w:rPr>
           <w:fldChar w:fldCharType="end"/>
@@ -232,11 +395,10 @@
         </w:tabs>
         <w:rPr>
           <w:rFonts w:asciiTheme="minorHAnsi" w:eastAsiaTheme="minorEastAsia" w:hAnsiTheme="minorHAnsi"/>
-          <w:noProof/>
           <w:kern w:val="2"/>
           <w:sz w:val="24"/>
           <w:szCs w:val="24"/>
-          <w:lang w:val="es-CO" w:eastAsia="es-CO"/>
+          <w:lang w:eastAsia="es-CO"/>
           <w14:ligatures w14:val="standardContextual"/>
         </w:rPr>
       </w:pPr>
@@ -244,54 +406,46 @@
         <w:r>
           <w:rPr>
             <w:rStyle w:val="Hipervnculo"/>
-            <w:noProof/>
           </w:rPr>
           <w:t>2. Planteamiento de la necesidad</w:t>
         </w:r>
         <w:r>
           <w:rPr>
-            <w:noProof/>
             <w:webHidden/>
           </w:rPr>
           <w:tab/>
         </w:r>
         <w:r>
           <w:rPr>
-            <w:noProof/>
             <w:webHidden/>
           </w:rPr>
           <w:fldChar w:fldCharType="begin"/>
         </w:r>
         <w:r>
           <w:rPr>
-            <w:noProof/>
             <w:webHidden/>
           </w:rPr>
           <w:instrText xml:space="preserve"> PAGEREF _Toc243829178 \h </w:instrText>
         </w:r>
         <w:r>
           <w:rPr>
-            <w:noProof/>
             <w:webHidden/>
           </w:rPr>
         </w:r>
         <w:r>
           <w:rPr>
-            <w:noProof/>
             <w:webHidden/>
           </w:rPr>
           <w:fldChar w:fldCharType="separate"/>
         </w:r>
         <w:r>
           <w:rPr>
-            <w:noProof/>
             <w:webHidden/>
           </w:rPr>
           <w:t>3</w:t>
         </w:r>
         <w:r>
           <w:rPr>
-            <w:noProof/>
             <w:webHidden/>
           </w:rPr>
           <w:fldChar w:fldCharType="end"/>
@@ -306,11 +460,10 @@
         </w:tabs>
         <w:rPr>
           <w:rFonts w:asciiTheme="minorHAnsi" w:eastAsiaTheme="minorEastAsia" w:hAnsiTheme="minorHAnsi"/>
-          <w:noProof/>
           <w:kern w:val="2"/>
           <w:sz w:val="24"/>
           <w:szCs w:val="24"/>
-          <w:lang w:val="es-CO" w:eastAsia="es-CO"/>
+          <w:lang w:eastAsia="es-CO"/>
           <w14:ligatures w14:val="standardContextual"/>
         </w:rPr>
       </w:pPr>
@@ -318,54 +471,46 @@
         <w:r>
           <w:rPr>
             <w:rStyle w:val="Hipervnculo"/>
-            <w:noProof/>
           </w:rPr>
           <w:t>2.1 Escenario y beneficiario</w:t>
         </w:r>
         <w:r>
           <w:rPr>
-            <w:noProof/>
             <w:webHidden/>
           </w:rPr>
           <w:tab/>
         </w:r>
         <w:r>
           <w:rPr>
-            <w:noProof/>
             <w:webHidden/>
           </w:rPr>
           <w:fldChar w:fldCharType="begin"/>
         </w:r>
         <w:r>
           <w:rPr>
-            <w:noProof/>
             <w:webHidden/>
           </w:rPr>
           <w:instrText xml:space="preserve"> PAGEREF _Toc243829179 \h </w:instrText>
         </w:r>
         <w:r>
           <w:rPr>
-            <w:noProof/>
             <w:webHidden/>
           </w:rPr>
         </w:r>
         <w:r>
           <w:rPr>
-            <w:noProof/>
             <w:webHidden/>
           </w:rPr>
           <w:fldChar w:fldCharType="separate"/>
         </w:r>
         <w:r>
           <w:rPr>
-            <w:noProof/>
             <w:webHidden/>
           </w:rPr>
           <w:t>3</w:t>
         </w:r>
         <w:r>
           <w:rPr>
-            <w:noProof/>
             <w:webHidden/>
           </w:rPr>
           <w:fldChar w:fldCharType="end"/>
@@ -380,11 +525,10 @@
         </w:tabs>
         <w:rPr>
           <w:rFonts w:asciiTheme="minorHAnsi" w:eastAsiaTheme="minorEastAsia" w:hAnsiTheme="minorHAnsi"/>
-          <w:noProof/>
           <w:kern w:val="2"/>
           <w:sz w:val="24"/>
           <w:szCs w:val="24"/>
-          <w:lang w:val="es-CO" w:eastAsia="es-CO"/>
+          <w:lang w:eastAsia="es-CO"/>
           <w14:ligatures w14:val="standardContextual"/>
         </w:rPr>
       </w:pPr>
@@ -392,54 +536,46 @@
         <w:r>
           <w:rPr>
             <w:rStyle w:val="Hipervnculo"/>
-            <w:noProof/>
           </w:rPr>
           <w:t>2.2 Necesidad de información</w:t>
         </w:r>
         <w:r>
           <w:rPr>
-            <w:noProof/>
             <w:webHidden/>
           </w:rPr>
           <w:tab/>
         </w:r>
         <w:r>
           <w:rPr>
-            <w:noProof/>
             <w:webHidden/>
           </w:rPr>
           <w:fldChar w:fldCharType="begin"/>
         </w:r>
         <w:r>
           <w:rPr>
-            <w:noProof/>
             <w:webHidden/>
           </w:rPr>
           <w:instrText xml:space="preserve"> PAGEREF _Toc243829180 \h </w:instrText>
         </w:r>
         <w:r>
           <w:rPr>
-            <w:noProof/>
             <w:webHidden/>
           </w:rPr>
         </w:r>
         <w:r>
           <w:rPr>
-            <w:noProof/>
             <w:webHidden/>
           </w:rPr>
           <w:fldChar w:fldCharType="separate"/>
         </w:r>
         <w:r>
           <w:rPr>
-            <w:noProof/>
             <w:webHidden/>
           </w:rPr>
           <w:t>3</w:t>
         </w:r>
         <w:r>
           <w:rPr>
-            <w:noProof/>
             <w:webHidden/>
           </w:rPr>
           <w:fldChar w:fldCharType="end"/>
@@ -454,11 +590,10 @@
         </w:tabs>
         <w:rPr>
           <w:rFonts w:asciiTheme="minorHAnsi" w:eastAsiaTheme="minorEastAsia" w:hAnsiTheme="minorHAnsi"/>
-          <w:noProof/>
           <w:kern w:val="2"/>
           <w:sz w:val="24"/>
           <w:szCs w:val="24"/>
-          <w:lang w:val="es-CO" w:eastAsia="es-CO"/>
+          <w:lang w:eastAsia="es-CO"/>
           <w14:ligatures w14:val="standardContextual"/>
         </w:rPr>
       </w:pPr>
@@ -466,54 +601,46 @@
         <w:r>
           <w:rPr>
             <w:rStyle w:val="Hipervnculo"/>
-            <w:noProof/>
           </w:rPr>
           <w:t>2.3 Pregunta de análisis</w:t>
         </w:r>
         <w:r>
           <w:rPr>
-            <w:noProof/>
             <w:webHidden/>
           </w:rPr>
           <w:tab/>
         </w:r>
         <w:r>
           <w:rPr>
-            <w:noProof/>
             <w:webHidden/>
           </w:rPr>
           <w:fldChar w:fldCharType="begin"/>
         </w:r>
         <w:r>
           <w:rPr>
-            <w:noProof/>
             <w:webHidden/>
           </w:rPr>
           <w:instrText xml:space="preserve"> PAGEREF _Toc243829181 \h </w:instrText>
         </w:r>
         <w:r>
           <w:rPr>
-            <w:noProof/>
             <w:webHidden/>
           </w:rPr>
         </w:r>
         <w:r>
           <w:rPr>
-            <w:noProof/>
             <w:webHidden/>
           </w:rPr>
           <w:fldChar w:fldCharType="separate"/>
         </w:r>
         <w:r>
           <w:rPr>
-            <w:noProof/>
             <w:webHidden/>
           </w:rPr>
           <w:t>4</w:t>
         </w:r>
         <w:r>
           <w:rPr>
-            <w:noProof/>
             <w:webHidden/>
           </w:rPr>
           <w:fldChar w:fldCharType="end"/>
@@ -528,11 +655,10 @@
         </w:tabs>
         <w:rPr>
           <w:rFonts w:asciiTheme="minorHAnsi" w:eastAsiaTheme="minorEastAsia" w:hAnsiTheme="minorHAnsi"/>
-          <w:noProof/>
           <w:kern w:val="2"/>
           <w:sz w:val="24"/>
           <w:szCs w:val="24"/>
-          <w:lang w:val="es-CO" w:eastAsia="es-CO"/>
+          <w:lang w:eastAsia="es-CO"/>
           <w14:ligatures w14:val="standardContextual"/>
         </w:rPr>
       </w:pPr>
@@ -540,54 +666,46 @@
         <w:r>
           <w:rPr>
             <w:rStyle w:val="Hipervnculo"/>
-            <w:noProof/>
           </w:rPr>
           <w:t>3. Justificación</w:t>
         </w:r>
         <w:r>
           <w:rPr>
-            <w:noProof/>
             <w:webHidden/>
           </w:rPr>
           <w:tab/>
         </w:r>
         <w:r>
           <w:rPr>
-            <w:noProof/>
             <w:webHidden/>
           </w:rPr>
           <w:fldChar w:fldCharType="begin"/>
         </w:r>
         <w:r>
           <w:rPr>
-            <w:noProof/>
             <w:webHidden/>
           </w:rPr>
           <w:instrText xml:space="preserve"> PAGEREF _Toc243829182 \h </w:instrText>
         </w:r>
         <w:r>
           <w:rPr>
-            <w:noProof/>
             <w:webHidden/>
           </w:rPr>
         </w:r>
         <w:r>
           <w:rPr>
-            <w:noProof/>
             <w:webHidden/>
           </w:rPr>
           <w:fldChar w:fldCharType="separate"/>
         </w:r>
         <w:r>
           <w:rPr>
-            <w:noProof/>
             <w:webHidden/>
           </w:rPr>
           <w:t>4</w:t>
         </w:r>
         <w:r>
           <w:rPr>
-            <w:noProof/>
             <w:webHidden/>
           </w:rPr>
           <w:fldChar w:fldCharType="end"/>
@@ -602,11 +720,10 @@
         </w:tabs>
         <w:rPr>
           <w:rFonts w:asciiTheme="minorHAnsi" w:eastAsiaTheme="minorEastAsia" w:hAnsiTheme="minorHAnsi"/>
-          <w:noProof/>
           <w:kern w:val="2"/>
           <w:sz w:val="24"/>
           <w:szCs w:val="24"/>
-          <w:lang w:val="es-CO" w:eastAsia="es-CO"/>
+          <w:lang w:eastAsia="es-CO"/>
           <w14:ligatures w14:val="standardContextual"/>
         </w:rPr>
       </w:pPr>
@@ -614,54 +731,46 @@
         <w:r>
           <w:rPr>
             <w:rStyle w:val="Hipervnculo"/>
-            <w:noProof/>
           </w:rPr>
           <w:t>4. Objetivos</w:t>
         </w:r>
         <w:r>
           <w:rPr>
-            <w:noProof/>
             <w:webHidden/>
           </w:rPr>
           <w:tab/>
         </w:r>
         <w:r>
           <w:rPr>
-            <w:noProof/>
             <w:webHidden/>
           </w:rPr>
           <w:fldChar w:fldCharType="begin"/>
         </w:r>
         <w:r>
           <w:rPr>
-            <w:noProof/>
             <w:webHidden/>
           </w:rPr>
           <w:instrText xml:space="preserve"> PAGEREF _Toc243829183 \h </w:instrText>
         </w:r>
         <w:r>
           <w:rPr>
-            <w:noProof/>
             <w:webHidden/>
           </w:rPr>
         </w:r>
         <w:r>
           <w:rPr>
-            <w:noProof/>
             <w:webHidden/>
           </w:rPr>
           <w:fldChar w:fldCharType="separate"/>
         </w:r>
         <w:r>
           <w:rPr>
-            <w:noProof/>
             <w:webHidden/>
           </w:rPr>
           <w:t>4</w:t>
         </w:r>
         <w:r>
           <w:rPr>
-            <w:noProof/>
             <w:webHidden/>
           </w:rPr>
           <w:fldChar w:fldCharType="end"/>
@@ -676,11 +785,10 @@
         </w:tabs>
         <w:rPr>
           <w:rFonts w:asciiTheme="minorHAnsi" w:eastAsiaTheme="minorEastAsia" w:hAnsiTheme="minorHAnsi"/>
-          <w:noProof/>
           <w:kern w:val="2"/>
           <w:sz w:val="24"/>
           <w:szCs w:val="24"/>
-          <w:lang w:val="es-CO" w:eastAsia="es-CO"/>
+          <w:lang w:eastAsia="es-CO"/>
           <w14:ligatures w14:val="standardContextual"/>
         </w:rPr>
       </w:pPr>
@@ -688,54 +796,46 @@
         <w:r>
           <w:rPr>
             <w:rStyle w:val="Hipervnculo"/>
-            <w:noProof/>
           </w:rPr>
           <w:t>4.1 Objetivo general</w:t>
         </w:r>
         <w:r>
           <w:rPr>
-            <w:noProof/>
             <w:webHidden/>
           </w:rPr>
           <w:tab/>
         </w:r>
         <w:r>
           <w:rPr>
-            <w:noProof/>
             <w:webHidden/>
           </w:rPr>
           <w:fldChar w:fldCharType="begin"/>
         </w:r>
         <w:r>
           <w:rPr>
-            <w:noProof/>
             <w:webHidden/>
           </w:rPr>
           <w:instrText xml:space="preserve"> PAGEREF _Toc243829184 \h </w:instrText>
         </w:r>
         <w:r>
           <w:rPr>
-            <w:noProof/>
             <w:webHidden/>
           </w:rPr>
         </w:r>
         <w:r>
           <w:rPr>
-            <w:noProof/>
             <w:webHidden/>
           </w:rPr>
           <w:fldChar w:fldCharType="separate"/>
         </w:r>
         <w:r>
           <w:rPr>
-            <w:noProof/>
             <w:webHidden/>
           </w:rPr>
           <w:t>4</w:t>
         </w:r>
         <w:r>
           <w:rPr>
-            <w:noProof/>
             <w:webHidden/>
           </w:rPr>
           <w:fldChar w:fldCharType="end"/>
@@ -750,11 +850,10 @@
         </w:tabs>
         <w:rPr>
           <w:rFonts w:asciiTheme="minorHAnsi" w:eastAsiaTheme="minorEastAsia" w:hAnsiTheme="minorHAnsi"/>
-          <w:noProof/>
           <w:kern w:val="2"/>
           <w:sz w:val="24"/>
           <w:szCs w:val="24"/>
-          <w:lang w:val="es-CO" w:eastAsia="es-CO"/>
+          <w:lang w:eastAsia="es-CO"/>
           <w14:ligatures w14:val="standardContextual"/>
         </w:rPr>
       </w:pPr>
@@ -762,54 +861,46 @@
         <w:r>
           <w:rPr>
             <w:rStyle w:val="Hipervnculo"/>
-            <w:noProof/>
           </w:rPr>
           <w:t>4.2 Objetivos específicos</w:t>
         </w:r>
         <w:r>
           <w:rPr>
-            <w:noProof/>
             <w:webHidden/>
           </w:rPr>
           <w:tab/>
         </w:r>
         <w:r>
           <w:rPr>
-            <w:noProof/>
             <w:webHidden/>
           </w:rPr>
           <w:fldChar w:fldCharType="begin"/>
         </w:r>
         <w:r>
           <w:rPr>
-            <w:noProof/>
             <w:webHidden/>
           </w:rPr>
           <w:instrText xml:space="preserve"> PAGEREF _Toc243829185 \h </w:instrText>
         </w:r>
         <w:r>
           <w:rPr>
-            <w:noProof/>
             <w:webHidden/>
           </w:rPr>
         </w:r>
         <w:r>
           <w:rPr>
-            <w:noProof/>
             <w:webHidden/>
           </w:rPr>
           <w:fldChar w:fldCharType="separate"/>
         </w:r>
         <w:r>
           <w:rPr>
-            <w:noProof/>
             <w:webHidden/>
           </w:rPr>
           <w:t>4</w:t>
         </w:r>
         <w:r>
           <w:rPr>
-            <w:noProof/>
             <w:webHidden/>
           </w:rPr>
           <w:fldChar w:fldCharType="end"/>
@@ -824,11 +915,10 @@
         </w:tabs>
         <w:rPr>
           <w:rFonts w:asciiTheme="minorHAnsi" w:eastAsiaTheme="minorEastAsia" w:hAnsiTheme="minorHAnsi"/>
-          <w:noProof/>
           <w:kern w:val="2"/>
           <w:sz w:val="24"/>
           <w:szCs w:val="24"/>
-          <w:lang w:val="es-CO" w:eastAsia="es-CO"/>
+          <w:lang w:eastAsia="es-CO"/>
           <w14:ligatures w14:val="standardContextual"/>
         </w:rPr>
       </w:pPr>
@@ -836,54 +926,46 @@
         <w:r>
           <w:rPr>
             <w:rStyle w:val="Hipervnculo"/>
-            <w:noProof/>
           </w:rPr>
           <w:t>5. Marco teórico inicial</w:t>
         </w:r>
         <w:r>
           <w:rPr>
-            <w:noProof/>
             <w:webHidden/>
           </w:rPr>
           <w:tab/>
         </w:r>
         <w:r>
           <w:rPr>
-            <w:noProof/>
             <w:webHidden/>
           </w:rPr>
           <w:fldChar w:fldCharType="begin"/>
         </w:r>
         <w:r>
           <w:rPr>
-            <w:noProof/>
             <w:webHidden/>
           </w:rPr>
           <w:instrText xml:space="preserve"> PAGEREF _Toc243829186 \h </w:instrText>
         </w:r>
         <w:r>
           <w:rPr>
-            <w:noProof/>
             <w:webHidden/>
           </w:rPr>
         </w:r>
         <w:r>
           <w:rPr>
-            <w:noProof/>
             <w:webHidden/>
           </w:rPr>
           <w:fldChar w:fldCharType="separate"/>
         </w:r>
         <w:r>
           <w:rPr>
-            <w:noProof/>
             <w:webHidden/>
           </w:rPr>
           <w:t>5</w:t>
         </w:r>
         <w:r>
           <w:rPr>
-            <w:noProof/>
             <w:webHidden/>
           </w:rPr>
           <w:fldChar w:fldCharType="end"/>
@@ -898,11 +980,10 @@
         </w:tabs>
         <w:rPr>
           <w:rFonts w:asciiTheme="minorHAnsi" w:eastAsiaTheme="minorEastAsia" w:hAnsiTheme="minorHAnsi"/>
-          <w:noProof/>
           <w:kern w:val="2"/>
           <w:sz w:val="24"/>
           <w:szCs w:val="24"/>
-          <w:lang w:val="es-CO" w:eastAsia="es-CO"/>
+          <w:lang w:eastAsia="es-CO"/>
           <w14:ligatures w14:val="standardContextual"/>
         </w:rPr>
       </w:pPr>
@@ -910,54 +991,46 @@
         <w:r>
           <w:rPr>
             <w:rStyle w:val="Hipervnculo"/>
-            <w:noProof/>
           </w:rPr>
           <w:t>5.1 Conceptos del dominio</w:t>
         </w:r>
         <w:r>
           <w:rPr>
-            <w:noProof/>
             <w:webHidden/>
           </w:rPr>
           <w:tab/>
         </w:r>
         <w:r>
           <w:rPr>
-            <w:noProof/>
             <w:webHidden/>
           </w:rPr>
           <w:fldChar w:fldCharType="begin"/>
         </w:r>
         <w:r>
           <w:rPr>
-            <w:noProof/>
             <w:webHidden/>
           </w:rPr>
           <w:instrText xml:space="preserve"> PAGEREF _Toc243829187 \h </w:instrText>
         </w:r>
         <w:r>
           <w:rPr>
-            <w:noProof/>
             <w:webHidden/>
           </w:rPr>
         </w:r>
         <w:r>
           <w:rPr>
-            <w:noProof/>
             <w:webHidden/>
           </w:rPr>
           <w:fldChar w:fldCharType="separate"/>
         </w:r>
         <w:r>
           <w:rPr>
-            <w:noProof/>
             <w:webHidden/>
           </w:rPr>
           <w:t>5</w:t>
         </w:r>
         <w:r>
           <w:rPr>
-            <w:noProof/>
             <w:webHidden/>
           </w:rPr>
           <w:fldChar w:fldCharType="end"/>
@@ -972,11 +1045,10 @@
         </w:tabs>
         <w:rPr>
           <w:rFonts w:asciiTheme="minorHAnsi" w:eastAsiaTheme="minorEastAsia" w:hAnsiTheme="minorHAnsi"/>
-          <w:noProof/>
           <w:kern w:val="2"/>
           <w:sz w:val="24"/>
           <w:szCs w:val="24"/>
-          <w:lang w:val="es-CO" w:eastAsia="es-CO"/>
+          <w:lang w:eastAsia="es-CO"/>
           <w14:ligatures w14:val="standardContextual"/>
         </w:rPr>
       </w:pPr>
@@ -984,54 +1056,46 @@
         <w:r>
           <w:rPr>
             <w:rStyle w:val="Hipervnculo"/>
-            <w:noProof/>
           </w:rPr>
           <w:t>5.2 Conceptos de analítica descriptiva</w:t>
         </w:r>
         <w:r>
           <w:rPr>
-            <w:noProof/>
             <w:webHidden/>
           </w:rPr>
           <w:tab/>
         </w:r>
         <w:r>
           <w:rPr>
-            <w:noProof/>
             <w:webHidden/>
           </w:rPr>
           <w:fldChar w:fldCharType="begin"/>
         </w:r>
         <w:r>
           <w:rPr>
-            <w:noProof/>
             <w:webHidden/>
           </w:rPr>
           <w:instrText xml:space="preserve"> PAGEREF _Toc243829188 \h </w:instrText>
         </w:r>
         <w:r>
           <w:rPr>
-            <w:noProof/>
             <w:webHidden/>
           </w:rPr>
         </w:r>
         <w:r>
           <w:rPr>
-            <w:noProof/>
             <w:webHidden/>
           </w:rPr>
           <w:fldChar w:fldCharType="separate"/>
         </w:r>
         <w:r>
           <w:rPr>
-            <w:noProof/>
             <w:webHidden/>
           </w:rPr>
           <w:t>5</w:t>
         </w:r>
         <w:r>
           <w:rPr>
-            <w:noProof/>
             <w:webHidden/>
           </w:rPr>
           <w:fldChar w:fldCharType="end"/>
@@ -1046,11 +1110,10 @@
         </w:tabs>
         <w:rPr>
           <w:rFonts w:asciiTheme="minorHAnsi" w:eastAsiaTheme="minorEastAsia" w:hAnsiTheme="minorHAnsi"/>
-          <w:noProof/>
           <w:kern w:val="2"/>
           <w:sz w:val="24"/>
           <w:szCs w:val="24"/>
-          <w:lang w:val="es-CO" w:eastAsia="es-CO"/>
+          <w:lang w:eastAsia="es-CO"/>
           <w14:ligatures w14:val="standardContextual"/>
         </w:rPr>
       </w:pPr>
@@ -1058,54 +1121,46 @@
         <w:r>
           <w:rPr>
             <w:rStyle w:val="Hipervnculo"/>
-            <w:noProof/>
           </w:rPr>
           <w:t>6. Metodología de la etapa 1</w:t>
         </w:r>
         <w:r>
           <w:rPr>
-            <w:noProof/>
             <w:webHidden/>
           </w:rPr>
           <w:tab/>
         </w:r>
         <w:r>
           <w:rPr>
-            <w:noProof/>
             <w:webHidden/>
           </w:rPr>
           <w:fldChar w:fldCharType="begin"/>
         </w:r>
         <w:r>
           <w:rPr>
-            <w:noProof/>
             <w:webHidden/>
           </w:rPr>
           <w:instrText xml:space="preserve"> PAGEREF _Toc243829189 \h </w:instrText>
         </w:r>
         <w:r>
           <w:rPr>
-            <w:noProof/>
             <w:webHidden/>
           </w:rPr>
         </w:r>
         <w:r>
           <w:rPr>
-            <w:noProof/>
             <w:webHidden/>
           </w:rPr>
           <w:fldChar w:fldCharType="separate"/>
         </w:r>
         <w:r>
           <w:rPr>
-            <w:noProof/>
             <w:webHidden/>
           </w:rPr>
           <w:t>6</w:t>
         </w:r>
         <w:r>
           <w:rPr>
-            <w:noProof/>
             <w:webHidden/>
           </w:rPr>
           <w:fldChar w:fldCharType="end"/>
@@ -1120,11 +1175,10 @@
         </w:tabs>
         <w:rPr>
           <w:rFonts w:asciiTheme="minorHAnsi" w:eastAsiaTheme="minorEastAsia" w:hAnsiTheme="minorHAnsi"/>
-          <w:noProof/>
           <w:kern w:val="2"/>
           <w:sz w:val="24"/>
           <w:szCs w:val="24"/>
-          <w:lang w:val="es-CO" w:eastAsia="es-CO"/>
+          <w:lang w:eastAsia="es-CO"/>
           <w14:ligatures w14:val="standardContextual"/>
         </w:rPr>
       </w:pPr>
@@ -1132,54 +1186,46 @@
         <w:r>
           <w:rPr>
             <w:rStyle w:val="Hipervnculo"/>
-            <w:noProof/>
           </w:rPr>
           <w:t>6.1 Selección y ficha del dataset</w:t>
         </w:r>
         <w:r>
           <w:rPr>
-            <w:noProof/>
             <w:webHidden/>
           </w:rPr>
           <w:tab/>
         </w:r>
         <w:r>
           <w:rPr>
-            <w:noProof/>
             <w:webHidden/>
           </w:rPr>
           <w:fldChar w:fldCharType="begin"/>
         </w:r>
         <w:r>
           <w:rPr>
-            <w:noProof/>
             <w:webHidden/>
           </w:rPr>
           <w:instrText xml:space="preserve"> PAGEREF _Toc243829190 \h </w:instrText>
         </w:r>
         <w:r>
           <w:rPr>
-            <w:noProof/>
             <w:webHidden/>
           </w:rPr>
         </w:r>
         <w:r>
           <w:rPr>
-            <w:noProof/>
             <w:webHidden/>
           </w:rPr>
           <w:fldChar w:fldCharType="separate"/>
         </w:r>
         <w:r>
           <w:rPr>
-            <w:noProof/>
             <w:webHidden/>
           </w:rPr>
           <w:t>6</w:t>
         </w:r>
         <w:r>
           <w:rPr>
-            <w:noProof/>
             <w:webHidden/>
           </w:rPr>
           <w:fldChar w:fldCharType="end"/>
@@ -1194,11 +1240,10 @@
         </w:tabs>
         <w:rPr>
           <w:rFonts w:asciiTheme="minorHAnsi" w:eastAsiaTheme="minorEastAsia" w:hAnsiTheme="minorHAnsi"/>
-          <w:noProof/>
           <w:kern w:val="2"/>
           <w:sz w:val="24"/>
           <w:szCs w:val="24"/>
-          <w:lang w:val="es-CO" w:eastAsia="es-CO"/>
+          <w:lang w:eastAsia="es-CO"/>
           <w14:ligatures w14:val="standardContextual"/>
         </w:rPr>
       </w:pPr>
@@ -1206,54 +1251,46 @@
         <w:r>
           <w:rPr>
             <w:rStyle w:val="Hipervnculo"/>
-            <w:noProof/>
           </w:rPr>
           <w:t>6.2 Unidad de análisis</w:t>
         </w:r>
         <w:r>
           <w:rPr>
-            <w:noProof/>
             <w:webHidden/>
           </w:rPr>
           <w:tab/>
         </w:r>
         <w:r>
           <w:rPr>
-            <w:noProof/>
             <w:webHidden/>
           </w:rPr>
           <w:fldChar w:fldCharType="begin"/>
         </w:r>
         <w:r>
           <w:rPr>
-            <w:noProof/>
             <w:webHidden/>
           </w:rPr>
           <w:instrText xml:space="preserve"> PAGEREF _Toc243829191 \h </w:instrText>
         </w:r>
         <w:r>
           <w:rPr>
-            <w:noProof/>
             <w:webHidden/>
           </w:rPr>
         </w:r>
         <w:r>
           <w:rPr>
-            <w:noProof/>
             <w:webHidden/>
           </w:rPr>
           <w:fldChar w:fldCharType="separate"/>
         </w:r>
         <w:r>
           <w:rPr>
-            <w:noProof/>
             <w:webHidden/>
           </w:rPr>
           <w:t>6</w:t>
         </w:r>
         <w:r>
           <w:rPr>
-            <w:noProof/>
             <w:webHidden/>
           </w:rPr>
           <w:fldChar w:fldCharType="end"/>
@@ -1268,11 +1305,10 @@
         </w:tabs>
         <w:rPr>
           <w:rFonts w:asciiTheme="minorHAnsi" w:eastAsiaTheme="minorEastAsia" w:hAnsiTheme="minorHAnsi"/>
-          <w:noProof/>
           <w:kern w:val="2"/>
           <w:sz w:val="24"/>
           <w:szCs w:val="24"/>
-          <w:lang w:val="es-CO" w:eastAsia="es-CO"/>
+          <w:lang w:eastAsia="es-CO"/>
           <w14:ligatures w14:val="standardContextual"/>
         </w:rPr>
       </w:pPr>
@@ -1280,54 +1316,46 @@
         <w:r>
           <w:rPr>
             <w:rStyle w:val="Hipervnculo"/>
-            <w:noProof/>
           </w:rPr>
           <w:t>6.3 Diccionario inicial de variables</w:t>
         </w:r>
         <w:r>
           <w:rPr>
-            <w:noProof/>
             <w:webHidden/>
           </w:rPr>
           <w:tab/>
         </w:r>
         <w:r>
           <w:rPr>
-            <w:noProof/>
             <w:webHidden/>
           </w:rPr>
           <w:fldChar w:fldCharType="begin"/>
         </w:r>
         <w:r>
           <w:rPr>
-            <w:noProof/>
             <w:webHidden/>
           </w:rPr>
           <w:instrText xml:space="preserve"> PAGEREF _Toc243829192 \h </w:instrText>
         </w:r>
         <w:r>
           <w:rPr>
-            <w:noProof/>
             <w:webHidden/>
           </w:rPr>
         </w:r>
         <w:r>
           <w:rPr>
-            <w:noProof/>
             <w:webHidden/>
           </w:rPr>
           <w:fldChar w:fldCharType="separate"/>
         </w:r>
         <w:r>
           <w:rPr>
-            <w:noProof/>
             <w:webHidden/>
           </w:rPr>
           <w:t>7</w:t>
         </w:r>
         <w:r>
           <w:rPr>
-            <w:noProof/>
             <w:webHidden/>
           </w:rPr>
           <w:fldChar w:fldCharType="end"/>
@@ -1342,11 +1370,10 @@
         </w:tabs>
         <w:rPr>
           <w:rFonts w:asciiTheme="minorHAnsi" w:eastAsiaTheme="minorEastAsia" w:hAnsiTheme="minorHAnsi"/>
-          <w:noProof/>
           <w:kern w:val="2"/>
           <w:sz w:val="24"/>
           <w:szCs w:val="24"/>
-          <w:lang w:val="es-CO" w:eastAsia="es-CO"/>
+          <w:lang w:eastAsia="es-CO"/>
           <w14:ligatures w14:val="standardContextual"/>
         </w:rPr>
       </w:pPr>
@@ -1354,54 +1381,46 @@
         <w:r>
           <w:rPr>
             <w:rStyle w:val="Hipervnculo"/>
-            <w:noProof/>
           </w:rPr>
           <w:t>6.4 Alcance y limitaciones</w:t>
         </w:r>
         <w:r>
           <w:rPr>
-            <w:noProof/>
             <w:webHidden/>
           </w:rPr>
           <w:tab/>
         </w:r>
         <w:r>
           <w:rPr>
-            <w:noProof/>
             <w:webHidden/>
           </w:rPr>
           <w:fldChar w:fldCharType="begin"/>
         </w:r>
         <w:r>
           <w:rPr>
-            <w:noProof/>
             <w:webHidden/>
           </w:rPr>
           <w:instrText xml:space="preserve"> PAGEREF _Toc243829193 \h </w:instrText>
         </w:r>
         <w:r>
           <w:rPr>
-            <w:noProof/>
             <w:webHidden/>
           </w:rPr>
         </w:r>
         <w:r>
           <w:rPr>
-            <w:noProof/>
             <w:webHidden/>
           </w:rPr>
           <w:fldChar w:fldCharType="separate"/>
         </w:r>
         <w:r>
           <w:rPr>
-            <w:noProof/>
             <w:webHidden/>
           </w:rPr>
           <w:t>8</w:t>
         </w:r>
         <w:r>
           <w:rPr>
-            <w:noProof/>
             <w:webHidden/>
           </w:rPr>
           <w:fldChar w:fldCharType="end"/>
@@ -1416,11 +1435,10 @@
         </w:tabs>
         <w:rPr>
           <w:rFonts w:asciiTheme="minorHAnsi" w:eastAsiaTheme="minorEastAsia" w:hAnsiTheme="minorHAnsi"/>
-          <w:noProof/>
           <w:kern w:val="2"/>
           <w:sz w:val="24"/>
           <w:szCs w:val="24"/>
-          <w:lang w:val="es-CO" w:eastAsia="es-CO"/>
+          <w:lang w:eastAsia="es-CO"/>
           <w14:ligatures w14:val="standardContextual"/>
         </w:rPr>
       </w:pPr>
@@ -1428,54 +1446,46 @@
         <w:r>
           <w:rPr>
             <w:rStyle w:val="Hipervnculo"/>
-            <w:noProof/>
           </w:rPr>
           <w:t>6.5 Diseño inicial del análisis</w:t>
         </w:r>
         <w:r>
           <w:rPr>
-            <w:noProof/>
             <w:webHidden/>
           </w:rPr>
           <w:tab/>
         </w:r>
         <w:r>
           <w:rPr>
-            <w:noProof/>
             <w:webHidden/>
           </w:rPr>
           <w:fldChar w:fldCharType="begin"/>
         </w:r>
         <w:r>
           <w:rPr>
-            <w:noProof/>
             <w:webHidden/>
           </w:rPr>
           <w:instrText xml:space="preserve"> PAGEREF _Toc243829194 \h </w:instrText>
         </w:r>
         <w:r>
           <w:rPr>
-            <w:noProof/>
             <w:webHidden/>
           </w:rPr>
         </w:r>
         <w:r>
           <w:rPr>
-            <w:noProof/>
             <w:webHidden/>
           </w:rPr>
           <w:fldChar w:fldCharType="separate"/>
         </w:r>
         <w:r>
           <w:rPr>
-            <w:noProof/>
             <w:webHidden/>
           </w:rPr>
           <w:t>8</w:t>
         </w:r>
         <w:r>
           <w:rPr>
-            <w:noProof/>
             <w:webHidden/>
           </w:rPr>
           <w:fldChar w:fldCharType="end"/>
@@ -1490,11 +1500,10 @@
         </w:tabs>
         <w:rPr>
           <w:rFonts w:asciiTheme="minorHAnsi" w:eastAsiaTheme="minorEastAsia" w:hAnsiTheme="minorHAnsi"/>
-          <w:noProof/>
           <w:kern w:val="2"/>
           <w:sz w:val="24"/>
           <w:szCs w:val="24"/>
-          <w:lang w:val="es-CO" w:eastAsia="es-CO"/>
+          <w:lang w:eastAsia="es-CO"/>
           <w14:ligatures w14:val="standardContextual"/>
         </w:rPr>
       </w:pPr>
@@ -1502,54 +1511,46 @@
         <w:r>
           <w:rPr>
             <w:rStyle w:val="Hipervnculo"/>
-            <w:noProof/>
           </w:rPr>
           <w:t>7. Reconocimiento del dataset</w:t>
         </w:r>
         <w:r>
           <w:rPr>
-            <w:noProof/>
             <w:webHidden/>
           </w:rPr>
           <w:tab/>
         </w:r>
         <w:r>
           <w:rPr>
-            <w:noProof/>
             <w:webHidden/>
           </w:rPr>
           <w:fldChar w:fldCharType="begin"/>
         </w:r>
         <w:r>
           <w:rPr>
-            <w:noProof/>
             <w:webHidden/>
           </w:rPr>
           <w:instrText xml:space="preserve"> PAGEREF _Toc243829195 \h </w:instrText>
         </w:r>
         <w:r>
           <w:rPr>
-            <w:noProof/>
             <w:webHidden/>
           </w:rPr>
         </w:r>
         <w:r>
           <w:rPr>
-            <w:noProof/>
             <w:webHidden/>
           </w:rPr>
           <w:fldChar w:fldCharType="separate"/>
         </w:r>
         <w:r>
           <w:rPr>
-            <w:noProof/>
             <w:webHidden/>
           </w:rPr>
           <w:t>9</w:t>
         </w:r>
         <w:r>
           <w:rPr>
-            <w:noProof/>
             <w:webHidden/>
           </w:rPr>
           <w:fldChar w:fldCharType="end"/>
@@ -1564,11 +1565,10 @@
         </w:tabs>
         <w:rPr>
           <w:rFonts w:asciiTheme="minorHAnsi" w:eastAsiaTheme="minorEastAsia" w:hAnsiTheme="minorHAnsi"/>
-          <w:noProof/>
           <w:kern w:val="2"/>
           <w:sz w:val="24"/>
           <w:szCs w:val="24"/>
-          <w:lang w:val="es-CO" w:eastAsia="es-CO"/>
+          <w:lang w:eastAsia="es-CO"/>
           <w14:ligatures w14:val="standardContextual"/>
         </w:rPr>
       </w:pPr>
@@ -1576,54 +1576,46 @@
         <w:r>
           <w:rPr>
             <w:rStyle w:val="Hipervnculo"/>
-            <w:noProof/>
           </w:rPr>
           <w:t>8. Referencias</w:t>
         </w:r>
         <w:r>
           <w:rPr>
-            <w:noProof/>
             <w:webHidden/>
           </w:rPr>
           <w:tab/>
         </w:r>
         <w:r>
           <w:rPr>
-            <w:noProof/>
             <w:webHidden/>
           </w:rPr>
           <w:fldChar w:fldCharType="begin"/>
         </w:r>
         <w:r>
           <w:rPr>
-            <w:noProof/>
             <w:webHidden/>
           </w:rPr>
           <w:instrText xml:space="preserve"> PAGEREF _Toc243829196 \h </w:instrText>
         </w:r>
         <w:r>
           <w:rPr>
-            <w:noProof/>
             <w:webHidden/>
           </w:rPr>
         </w:r>
         <w:r>
           <w:rPr>
-            <w:noProof/>
             <w:webHidden/>
           </w:rPr>
           <w:fldChar w:fldCharType="separate"/>
         </w:r>
         <w:r>
           <w:rPr>
-            <w:noProof/>
             <w:webHidden/>
           </w:rPr>
           <w:t>10</w:t>
         </w:r>
         <w:r>
           <w:rPr>
-            <w:noProof/>
             <w:webHidden/>
           </w:rPr>
           <w:fldChar w:fldCharType="end"/>
@@ -1638,11 +1630,10 @@
         </w:tabs>
         <w:rPr>
           <w:rFonts w:asciiTheme="minorHAnsi" w:eastAsiaTheme="minorEastAsia" w:hAnsiTheme="minorHAnsi"/>
-          <w:noProof/>
           <w:kern w:val="2"/>
           <w:sz w:val="24"/>
           <w:szCs w:val="24"/>
-          <w:lang w:val="es-CO" w:eastAsia="es-CO"/>
+          <w:lang w:eastAsia="es-CO"/>
           <w14:ligatures w14:val="standardContextual"/>
         </w:rPr>
       </w:pPr>
@@ -1650,54 +1641,46 @@
         <w:r>
           <w:rPr>
             <w:rStyle w:val="Hipervnculo"/>
-            <w:noProof/>
           </w:rPr>
           <w:t>Anexo A. Evidencias en el repositorio</w:t>
         </w:r>
         <w:r>
           <w:rPr>
-            <w:noProof/>
             <w:webHidden/>
           </w:rPr>
           <w:tab/>
         </w:r>
         <w:r>
           <w:rPr>
-            <w:noProof/>
             <w:webHidden/>
           </w:rPr>
           <w:fldChar w:fldCharType="begin"/>
         </w:r>
         <w:r>
           <w:rPr>
-            <w:noProof/>
             <w:webHidden/>
           </w:rPr>
           <w:instrText xml:space="preserve"> PAGEREF _Toc243829197 \h </w:instrText>
         </w:r>
         <w:r>
           <w:rPr>
-            <w:noProof/>
             <w:webHidden/>
           </w:rPr>
         </w:r>
         <w:r>
           <w:rPr>
-            <w:noProof/>
             <w:webHidden/>
           </w:rPr>
           <w:fldChar w:fldCharType="separate"/>
         </w:r>
         <w:r>
           <w:rPr>
-            <w:noProof/>
             <w:webHidden/>
           </w:rPr>
           <w:t>10</w:t>
         </w:r>
         <w:r>
           <w:rPr>
-            <w:noProof/>
             <w:webHidden/>
           </w:rPr>
           <w:fldChar w:fldCharType="end"/>
@@ -1751,6 +1734,7 @@
       </w:pPr>
       <w:bookmarkStart w:id="0" w:name="_Toc243829177"/>
       <w:r>
+        <w:lastRenderedPageBreak/>
         <w:t>1. Introducci</w:t>
       </w:r>
       <w:r>
@@ -1787,10 +1771,19 @@
     </w:p>
     <w:p>
       <w:pPr>
+        <w:spacing w:after="200"/>
+      </w:pPr>
+      <w:r>
+        <w:br w:type="page"/>
+      </w:r>
+    </w:p>
+    <w:p>
+      <w:pPr>
         <w:pStyle w:val="Ttulo1"/>
       </w:pPr>
       <w:bookmarkStart w:id="1" w:name="_Toc243829178"/>
       <w:r>
+        <w:lastRenderedPageBreak/>
         <w:t>2. Planteamiento de la necesidad</w:t>
       </w:r>
       <w:bookmarkEnd w:id="1"/>
@@ -1938,10 +1931,19 @@
     </w:p>
     <w:p>
       <w:pPr>
+        <w:spacing w:after="200"/>
+      </w:pPr>
+      <w:r>
+        <w:br w:type="page"/>
+      </w:r>
+    </w:p>
+    <w:p>
+      <w:pPr>
         <w:pStyle w:val="Ttulo1"/>
       </w:pPr>
       <w:bookmarkStart w:id="5" w:name="_Toc243829182"/>
       <w:r>
+        <w:lastRenderedPageBreak/>
         <w:t>3. Justificaci</w:t>
       </w:r>
       <w:r>
@@ -2030,10 +2032,19 @@
     </w:p>
     <w:p>
       <w:pPr>
+        <w:spacing w:after="200"/>
+      </w:pPr>
+      <w:r>
+        <w:br w:type="page"/>
+      </w:r>
+    </w:p>
+    <w:p>
+      <w:pPr>
         <w:pStyle w:val="Ttulo1"/>
       </w:pPr>
       <w:bookmarkStart w:id="6" w:name="_Toc243829183"/>
       <w:r>
+        <w:lastRenderedPageBreak/>
         <w:t>4. Objetivos</w:t>
       </w:r>
       <w:bookmarkEnd w:id="6"/>
@@ -2127,10 +2138,19 @@
     </w:p>
     <w:p>
       <w:pPr>
+        <w:spacing w:after="200"/>
+      </w:pPr>
+      <w:r>
+        <w:br w:type="page"/>
+      </w:r>
+    </w:p>
+    <w:p>
+      <w:pPr>
         <w:pStyle w:val="Ttulo1"/>
       </w:pPr>
       <w:bookmarkStart w:id="9" w:name="_Toc243829186"/>
       <w:r>
+        <w:lastRenderedPageBreak/>
         <w:t>5. Marco te</w:t>
       </w:r>
       <w:r>
@@ -2304,10 +2324,19 @@
     </w:p>
     <w:p>
       <w:pPr>
+        <w:spacing w:after="200"/>
+      </w:pPr>
+      <w:r>
+        <w:br w:type="page"/>
+      </w:r>
+    </w:p>
+    <w:p>
+      <w:pPr>
         <w:pStyle w:val="Ttulo1"/>
       </w:pPr>
       <w:bookmarkStart w:id="12" w:name="_Toc243829189"/>
       <w:r>
+        <w:lastRenderedPageBreak/>
         <w:t>6. Metodolog</w:t>
       </w:r>
       <w:r>
@@ -2339,10 +2368,7 @@
         <w:jc w:val="both"/>
       </w:pPr>
       <w:r>
-        <w:t>Se exploró el catálogo de Hugging Face Datasets buscando un conjunto tabular, público y de tamaño manejable. Debía tener una variable de resultado clara y variables de agrupación, para formular una necesidad descriptiva de negocio. Se compararon dos candidatos: scikit-learn/adult-census-income (ingresos según el censo de EE. UU. de 1994) y scikit-learn/churn-prediction. Se eligió el segundo porque permite plantear una necesidad de decisión empresarial concreta (retención de clientes) y combina categorías, c</w:t>
-      </w:r>
-      <w:r>
-        <w:t>antidades monetarias y un periodo (antigüedad), como pide la actividad.</w:t>
+        <w:t>Se exploró el catálogo de Hugging Face Datasets buscando un conjunto tabular, público y de tamaño manejable. Debía tener una variable de resultado clara y variables de agrupación, para formular una necesidad descriptiva de negocio. Se compararon dos candidatos: scikit-learn/adult-census-income (ingresos según el censo de EE. UU. de 1994) y scikit-learn/churn-prediction. Se eligió el segundo porque permite plantear una necesidad de decisión empresarial concreta (retención de clientes) y combina categorías, cantidades monetarias y un periodo (antigüedad), como pide la actividad.</w:t>
       </w:r>
     </w:p>
     <w:p>
@@ -2846,6 +2872,7 @@
       </w:pPr>
       <w:bookmarkStart w:id="15" w:name="_Toc243829192"/>
       <w:r>
+        <w:lastRenderedPageBreak/>
         <w:t>6.3 Diccionario inicial de variables</w:t>
       </w:r>
       <w:bookmarkEnd w:id="15"/>
@@ -4085,7 +4112,14 @@
               <w:rPr>
                 <w:sz w:val="19"/>
               </w:rPr>
-              <w:t>Monetaria; moneda no documentada (pendiente de verificar)</w:t>
+              <w:t xml:space="preserve">Monetaria; moneda no documentada (pendiente de </w:t>
+            </w:r>
+            <w:r>
+              <w:rPr>
+                <w:sz w:val="19"/>
+              </w:rPr>
+              <w:lastRenderedPageBreak/>
+              <w:t>verificar)</w:t>
             </w:r>
           </w:p>
         </w:tc>
@@ -4722,6 +4756,7 @@
       </w:pPr>
       <w:bookmarkStart w:id="18" w:name="_Toc243829195"/>
       <w:r>
+        <w:lastRenderedPageBreak/>
         <w:t>7. Reconocimiento del dataset</w:t>
       </w:r>
       <w:bookmarkEnd w:id="18"/>
@@ -5122,10 +5157,19 @@
     </w:p>
     <w:p>
       <w:pPr>
+        <w:spacing w:after="200"/>
+      </w:pPr>
+      <w:r>
+        <w:br w:type="page"/>
+      </w:r>
+    </w:p>
+    <w:p>
+      <w:pPr>
         <w:pStyle w:val="Ttulo1"/>
       </w:pPr>
       <w:bookmarkStart w:id="19" w:name="_Toc243829196"/>
       <w:r>
+        <w:lastRenderedPageBreak/>
         <w:t>8. Referencias</w:t>
       </w:r>
       <w:bookmarkEnd w:id="19"/>
@@ -5188,10 +5232,19 @@
     </w:p>
     <w:p>
       <w:pPr>
+        <w:spacing w:after="200"/>
+      </w:pPr>
+      <w:r>
+        <w:br w:type="page"/>
+      </w:r>
+    </w:p>
+    <w:p>
+      <w:pPr>
         <w:pStyle w:val="Ttulo1"/>
       </w:pPr>
       <w:bookmarkStart w:id="20" w:name="_Toc243829197"/>
       <w:r>
+        <w:lastRenderedPageBreak/>
         <w:t>Anexo A. Evidencias en el repositorio</w:t>
       </w:r>
       <w:bookmarkEnd w:id="20"/>
@@ -5204,37 +5257,7 @@
         <w:t xml:space="preserve">Repositorio de GitHub: </w:t>
       </w:r>
       <w:r>
-        <w:rPr>
-          <w:highlight w:val="yellow"/>
-        </w:rPr>
-        <w:t>[COMPLETAR con el enlace del repositorio]</w:t>
-      </w:r>
-    </w:p>
-    <w:p>
-      <w:pPr>
-        <w:pStyle w:val="Listaconvietas"/>
-        <w:jc w:val="both"/>
-      </w:pPr>
-      <w:r>
-        <w:t>AE2/notebooks/AE2_exploracion_churn.ipynb — notebook ejecutado con la carga y la descripción básica.</w:t>
-      </w:r>
-    </w:p>
-    <w:p>
-      <w:pPr>
-        <w:pStyle w:val="Listaconvietas"/>
-        <w:jc w:val="both"/>
-      </w:pPr>
-      <w:r>
-        <w:t>AE2/resultados/resumen_dataframe.txt — resumen del DataFrame generado automáticamente (UTF-8).</w:t>
-      </w:r>
-    </w:p>
-    <w:p>
-      <w:pPr>
-        <w:pStyle w:val="Listaconvietas"/>
-        <w:jc w:val="both"/>
-      </w:pPr>
-      <w:r>
-        <w:t>src/clases_po/ — clases HFDatasetLoader (obtención de datos) y Reportes (resumen .txt).</w:t>
+        <w:t>https://github.com/kevin4965-hue/PI3-AE2-churn</w:t>
       </w:r>
     </w:p>
     <w:sectPr>
@@ -5925,6 +5948,7 @@
     </w:pPr>
     <w:rPr>
       <w:rFonts w:ascii="Arial" w:eastAsia="Arial" w:hAnsi="Arial"/>
+      <w:lang w:val="es-CO"/>
     </w:rPr>
   </w:style>
   <w:style w:type="paragraph" w:styleId="Ttulo1">
@@ -16944,6 +16968,18 @@
       <w:u w:val="single"/>
     </w:rPr>
   </w:style>
+  <w:style w:type="character" w:styleId="Mencinsinresolver">
+    <w:name w:val="Unresolved Mention"/>
+    <w:basedOn w:val="Fuentedeprrafopredeter"/>
+    <w:uiPriority w:val="99"/>
+    <w:semiHidden/>
+    <w:unhideWhenUsed/>
+    <w:rsid w:val="001B238E"/>
+    <w:rPr>
+      <w:color w:val="605E5C"/>
+      <w:shd w:val="clear" w:color="auto" w:fill="E1DFDD"/>
+    </w:rPr>
+  </w:style>
 </w:styles>
 </file>
 

</xml_diff>